<commit_message>
Bring the report, README and dashboard in line with the new numbers
The narrative was still quoting the broken district figures (DDI around 45/70,
"84.9% in Q5") and the 10.1% affordability number that contradicted the 3.15%
basket used elsewhere. Everything now shows 27.5/52.4 and 70.7% of people in
rural districts. Dropped the "blend OpenCellID into coverage" method for the
honest two-level explanation, softened the sensitivity claim to 3rd-4th (it's
3rd under two schemes, not always 4th), and added the cross-country coverage
caveat, since peers self-report coverage and Zimbabwe's rank there is partly a
measurement artefact.
</commit_message>
<xml_diff>
--- a/Zimbabwe_Digital_Deserts_Stage2.docx
+++ b/Zimbabwe_Digital_Deserts_Stage2.docx
@@ -303,7 +303,7 @@
           <w:sz w:val="22"/>
           <w:szCs w:val="22"/>
         </w:rPr>
-        <w:t xml:space="preserve">areas where coverage is technically available but economically inaccessible. Zimbabweans spend roughly 10.1% of monthly income on 1 GB of mobile data — five times the UN Broadband Commission's 2% affordability target. As of Q4 2025, 5 GB of Wi-Fi data costs US$9 on Econet and US$7 on NetOne (Mo'Gigs), against a GNI per capita of US$2,400 and a 38.3% national poverty headcount.</w:t>
+        <w:t xml:space="preserve">areas where coverage is technically available but economically inaccessible. Zimbabwe's basic 1 GB mobile basket costs 3.15% of GNI per capita — above the UN Broadband Commission's 2% affordability target — but heavy use is punishing: the data-only 5 GB basket runs to 12.92% of GNI, over six times the target. As of Q4 2025, 5 GB of Wi-Fi data costs US$9 on Econet and US$7 on NetOne (Mo'Gigs), against a GNI per capita of US$2,400 and a 38.3% national poverty headcount.</w:t>
       </w:r>
     </w:p>
     <w:p>
@@ -331,7 +331,7 @@
           <w:sz w:val="22"/>
           <w:szCs w:val="22"/>
         </w:rPr>
-        <w:t xml:space="preserve">Zimbabwe has 10 provinces and 63 districts, with roughly </w:t>
+        <w:t xml:space="preserve">Zimbabwe has 10 provinces and 63 administrative districts, which the 2022 Census resolves into 91 urban and rural units, with roughly</w:t>
       </w:r>
       <w:r>
         <w:rPr>
@@ -1197,7 +1197,7 @@
           <w:sz w:val="22"/>
           <w:szCs w:val="22"/>
         </w:rPr>
-        <w:t xml:space="preserve">Our pipeline is implemented in Python (pandas, geopandas, matplotlib) and version-controlled in a public GitHub repository for full reproducibility. The codebase consists of eight scripts that can be run sequentially to reproduce every number and figure in this submission. The pipeline follows the standard Extract → Transform → Load → Analyse pattern.</w:t>
+        <w:t xml:space="preserve">Our pipeline is implemented in Python (pandas, geopandas, matplotlib) and version-controlled in a public GitHub repository for full reproducibility. The codebase consists of nine scripts that can be run sequentially to reproduce every number and figure in this submission. The pipeline follows the standard Extract → Transform → Load → Analyse pattern.</w:t>
       </w:r>
     </w:p>
     <w:p>
@@ -1345,7 +1345,7 @@
           <w:sz w:val="22"/>
           <w:szCs w:val="22"/>
         </w:rPr>
-        <w:t xml:space="preserve">. Downloads GADM 4.1 Zimbabwe admin level 2 boundaries (66 districts across 10 provinces) and joins them to POTRAZ coverage data and World Bank socio-economic indicators. Districts are classified as urban or rural based on a heuristic list of 10 designated urban districts. POTRAZ rural/urban coverage percentages are applied per district based on this classification. Where ZimStat district-level population data is not available, national population is apportioned by district area within each province. Base stations are allocated to districts within each urban/rural class weighted by population. Output: data/processed/zwe_districts_master.gpkg (GeoPackage with geometry) and data/processed/zwe_districts_master.csv (flat table).</w:t>
+        <w:t xml:space="preserve">. District populations come directly from the ZimStat 2022 Census (91 urban and rural units, 15.18 million people) — not from area apportionment — and each unit is classified urban or rural. POTRAZ rural/urban coverage percentages and World Bank rural/urban electricity figures are applied per class, and base stations are allocated within each class weighted by population. The district Digital Desert Index is computed by a dedicated, geopandas-free script (compute_district_ddi.py) so every number reproduces exactly; GADM 4.1 admin-2 geometry (build_district_table.py) is used only to draw the choropleth maps. Output: data/processed/zwe_districts_ddi_census.csv (district DDI) and data/processed/zwe_districts_master.gpkg (geometry for mapping).</w:t>
       </w:r>
     </w:p>
     <w:p>
@@ -1577,7 +1577,7 @@
           <w:sz w:val="22"/>
           <w:szCs w:val="22"/>
         </w:rPr>
-        <w:t xml:space="preserve">ITU DataHub reports Zimbabwe's 4G/LTE population coverage as 51.6% (2024). POTRAZ Q4 2025 reports 95.9% urban and 29.0% rural, which population-weighted gives 55.7%. We use the POTRAZ figure for Zimbabwe (more current, sub-national detail) and ITU figures for the SADC peers. The ~4-point gap between sources is noted but does not materially affect the ranking.</w:t>
+        <w:t xml:space="preserve">ITU DataHub reports Zimbabwe's 4G/LTE population coverage as 51.6% (2024). POTRAZ Q4 2025 reports 95.9% urban and 29.0% rural, which population-weighted gives 55.7%. We use the POTRAZ figure for Zimbabwe (more current, sub-national detail) and ITU figures for the SADC peers. The ~4-point gap between sources is noted but does not materially affect the ranking. One caveat on the cross-country comparison: each peer's coverage is its own regulator's self-reported ITU figure (Malawi 88.9%, Zambia 91.2%), whereas Zimbabwe's reflects POTRAZ reporting rural coverage honestly at 29%. The coverage pillar is therefore the least like-for-like of the four, and Zimbabwe's coverage rank is partly a measurement artefact — but the conclusion is unchanged: even zeroing Zimbabwe's coverage gap leaves it 4th of 6. The adoption, affordability and electricity pillars are on consistent bases.</w:t>
       </w:r>
     </w:p>
     <w:p>
@@ -1655,7 +1655,7 @@
           <w:sz w:val="22"/>
           <w:szCs w:val="22"/>
         </w:rPr>
-        <w:t xml:space="preserve">POTRAZ publishes coverage data at the national rural/urban level, not per district or province. Our district-level DDI therefore shows a binary pattern (urban DDI ≈ 45, rural DDI ≈ 70). True district-level variation would require POTRAZ provincial base-station data and ZimStat district populations for all 10 provinces (currently available for 4). OpenCellID tower density provides partial district-level variance as a cross-check.</w:t>
+        <w:t xml:space="preserve">POTRAZ publishes coverage data — and the World Bank publishes electricity access — only at the national rural/urban level, not per district. Our district-level DDI therefore shows a clean two-level pattern (urban DDI 27.5, rural DDI 52.4), differentiated by real 2022 Census populations. True per-district variation would require district-resolved coverage and electricity figures. OpenCellID tower density is reported as an independent cross-check but is deliberately excluded from the index: it is ~99% NetOne-biased and spatially noisy, and an earlier attempt to fold it into coverage produced artefacts (such as central districts appearing better covered than they are).</w:t>
       </w:r>
     </w:p>
     <w:p>
@@ -2152,7 +2152,7 @@
           <w:sz w:val="22"/>
           <w:szCs w:val="22"/>
         </w:rPr>
-        <w:t xml:space="preserve">Figure 6 — Choropleth map of Zimbabwe's 63 districts coloured by district-level Digital Desert Index, with hero districts annotated (in development).</w:t>
+        <w:t xml:space="preserve">Figure 6 — Choropleth map of Zimbabwe's districts coloured by district-level Digital Desert Index, with hero districts annotated (in development).</w:t>
       </w:r>
     </w:p>
     <w:p>
@@ -2576,7 +2576,7 @@
           <w:sz w:val="22"/>
           <w:szCs w:val="22"/>
         </w:rPr>
-        <w:t xml:space="preserve">, from near-zero in underserved districts to over 100 per 10,000 population in better-served areas. This is the district-level variance our DDI needs to move beyond the binary urban/rural classification.</w:t>
+        <w:t xml:space="preserve">, from near-zero in underserved districts to over 100 per 10,000 population in a few city-centre districts — the latter a known artefact of crowdsourced points clustering at landmarks. Because this signal is ~99% NetOne and spatially noisy, we report it as a cross-check but do not fold it into the DDI.</w:t>
       </w:r>
     </w:p>
     <w:p>
@@ -4168,7 +4168,7 @@
           <w:sz w:val="22"/>
           <w:szCs w:val="22"/>
         </w:rPr>
-        <w:t xml:space="preserve">it has by far the worst coverage gap (44.3) in the group — worse than Malawi, Mozambique and Zambia which all have 85%+ 4G coverage. Yet Zimbabwe's affordability (31.5) and electricity (48.6) are mid-range. </w:t>
+        <w:t xml:space="preserve">it has by far the worst coverage gap (44.3) in the group — worse than Malawi, Mozambique and Zambia which all have 85%+ 4G coverage. Yet Zimbabwe's affordability (31.5) and electricity (48.6) are mid-range. This mid-pack position is robust: under six alternative pillar-weighting schemes (reproduced by compute_ddi.py into ddi_sensitivity.csv), Zimbabwe stays between 3rd and 4th of six — it never leaves the bottom half.</w:t>
       </w:r>
       <w:r>
         <w:rPr>
@@ -4213,7 +4213,7 @@
           <w:sz w:val="22"/>
           <w:szCs w:val="22"/>
         </w:rPr>
-        <w:t xml:space="preserve">We have built and run the district-level pipeline using GADM 4.1 admin level 2 boundaries joined to POTRAZ Q4 2025 coverage data and World Bank socio-economic indicators. The pilot version uses an urban/rural classification (10 designated urban districts, 53 rural) and the national rural/urban POTRAZ figures applied per district. Two findings emerge clearly:</w:t>
+        <w:t xml:space="preserve">We have built and run the district-level pipeline on the ZimStat 2022 Census districts (mapped onto GADM admin-2 boundaries for the choropleths), joined to POTRAZ Q4 2025 coverage and World Bank socio-economic indicators. It resolves 91 urban and rural units (30 urban, 61 rural) and applies the national rural/urban POTRAZ coverage and World Bank electricity figures per class. Two findings emerge clearly:</w:t>
       </w:r>
     </w:p>
     <w:p>
@@ -4233,14 +4233,14 @@
           <w:sz w:val="22"/>
           <w:szCs w:val="22"/>
         </w:rPr>
-        <w:t xml:space="preserve">84.9% of Zimbabwe's population (~14.1 million people) lives in districts classified as Q5 (worst quintile) of the Digital Desert Index</w:t>
-      </w:r>
-      <w:r>
-        <w:rPr>
-          <w:sz w:val="22"/>
-          <w:szCs w:val="22"/>
-        </w:rPr>
-        <w:t xml:space="preserve">. Only 10 districts (concentrated in Bulawayo, Harare metro, Mutare, Gweru, Kwekwe, Kadoma, Masvingo and Hwange) fall into Q1 (best), covering just 15.1% of the population.</w:t>
+        <w:t xml:space="preserve">70.7% of Zimbabwe's population (10.7 million people) lives in rural districts — the worst-served tier of the Digital Desert Index, scoring 52.4</w:t>
+      </w:r>
+      <w:r>
+        <w:rPr>
+          <w:sz w:val="22"/>
+          <w:szCs w:val="22"/>
+        </w:rPr>
+        <w:t xml:space="preserve">. The 30 urban districts (Bulawayo, the Harare metro, Mutare, Gweru, Kwekwe, Kadoma, Masvingo, Hwange and other towns) hold the remaining 29.3% (4.4 million people) at a far lower DDI of 27.5.</w:t>
       </w:r>
     </w:p>
     <w:p>
@@ -4259,14 +4259,14 @@
           <w:sz w:val="22"/>
           <w:szCs w:val="22"/>
         </w:rPr>
-        <w:t xml:space="preserve">The current DDI shows a binary distribution (urban DDI ≈ 45 vs rural DDI ≈ 70) because district-resolved POTRAZ coverage data is not available at sub-national level</w:t>
-      </w:r>
-      <w:r>
-        <w:rPr>
-          <w:sz w:val="22"/>
-          <w:szCs w:val="22"/>
-        </w:rPr>
-        <w:t xml:space="preserve">. Future iterations can introduce district-level variance by integrating ZimStat census-derived urban share per district (currently available for 4 of 10 provinces) and OpenCellID tower density as a coverage proxy. The pipeline architecture is in place and will accept district-resolved inputs without code changes.</w:t>
+        <w:t xml:space="preserve">The current DDI shows a two-level distribution (urban DDI 27.5 vs rural DDI 52.4) because POTRAZ coverage and World Bank electricity are published only at the national urban/rural level</w:t>
+      </w:r>
+      <w:r>
+        <w:rPr>
+          <w:sz w:val="22"/>
+          <w:szCs w:val="22"/>
+        </w:rPr>
+        <w:t xml:space="preserve">. Genuine per-district variance requires district-resolved coverage and electricity data; OpenCellID was tested as a coverage proxy but proved too NetOne-biased and spatially noisy to fold in responsibly, so it is reported only as a cross-check. The pipeline architecture is in place and will accept district-resolved inputs without code changes.</w:t>
       </w:r>
     </w:p>
     <w:p>
@@ -4653,7 +4653,7 @@
           <w:sz w:val="22"/>
           <w:szCs w:val="22"/>
         </w:rPr>
-        <w:t xml:space="preserve">84.9% of the population lives in districts classified as digitally excluded</w:t>
+        <w:t xml:space="preserve">70.7% of the population lives in rural districts that are digitally excluded</w:t>
       </w:r>
       <w:r>
         <w:rPr>
@@ -4702,7 +4702,7 @@
           <w:sz w:val="22"/>
           <w:szCs w:val="22"/>
         </w:rPr>
-        <w:t xml:space="preserve">The USF has historically been under-utilised for rural rollout. We recommend that POTRAZ adopt the DDI as the formal prioritisation framework for USF-backed infrastructure investment. Districts in the worst DDI quintile (currently 56 of 66) should receive first-priority USF funding for 4G base station deployment. The DDI provides a transparent, reproducible basis for investment decisions that replaces operator-driven site selection.</w:t>
+        <w:t xml:space="preserve">The USF has historically been under-utilised for rural rollout. We recommend that POTRAZ adopt the DDI as the formal prioritisation framework for USF-backed infrastructure investment. Districts in the worst-served rural tier (61 of 91) should receive first-priority USF funding for 4G base station deployment. The DDI provides a transparent, reproducible basis for investment decisions that replaces operator-driven site selection.</w:t>
       </w:r>
     </w:p>
     <w:p>

</xml_diff>

<commit_message>
Bring the report and README onto the 3rd-place framing
The dashboard now ranks countries best to worst (1 = best), which puts
Zimbabwe 3rd of 6. Updated the Word report and the README to match: where they
said 4th they now say 3rd, with South Africa and Botswana named as the only
two ahead. The robustness range is still 3rd-4th either way, and the README
notes that ddi_sensitivity.csv keeps the raw index rank where 1 is the most
excluded.
</commit_message>
<xml_diff>
--- a/Zimbabwe_Digital_Deserts_Stage2.docx
+++ b/Zimbabwe_Digital_Deserts_Stage2.docx
@@ -1577,7 +1577,7 @@
           <w:sz w:val="22"/>
           <w:szCs w:val="22"/>
         </w:rPr>
-        <w:t xml:space="preserve">ITU DataHub reports Zimbabwe's 4G/LTE population coverage as 51.6% (2024). POTRAZ Q4 2025 reports 95.9% urban and 29.0% rural, which population-weighted gives 55.7%. We use the POTRAZ figure for Zimbabwe (more current, sub-national detail) and ITU figures for the SADC peers. The ~4-point gap between sources is noted but does not materially affect the ranking. One caveat on the cross-country comparison: each peer's coverage is its own regulator's self-reported ITU figure (Malawi 88.9%, Zambia 91.2%), whereas Zimbabwe's reflects POTRAZ reporting rural coverage honestly at 29%. The coverage pillar is therefore the least like-for-like of the four, and Zimbabwe's coverage rank is partly a measurement artefact — but the conclusion is unchanged: even zeroing Zimbabwe's coverage gap leaves it 4th of 6. The adoption, affordability and electricity pillars are on consistent bases.</w:t>
+        <w:t xml:space="preserve">ITU DataHub reports Zimbabwe's 4G/LTE population coverage as 51.6% (2024). POTRAZ Q4 2025 reports 95.9% urban and 29.0% rural, which population-weighted gives 55.7%. We use the POTRAZ figure for Zimbabwe (more current, sub-national detail) and ITU figures for the SADC peers. The ~4-point gap between sources is noted but does not materially affect the ranking. One caveat on the cross-country comparison: each peer's coverage is its own regulator's self-reported ITU figure (Malawi 88.9%, Zambia 91.2%), whereas Zimbabwe's reflects POTRAZ reporting rural coverage honestly at 29%. The coverage pillar is therefore the least like-for-like of the four, and Zimbabwe's coverage rank is partly a measurement artefact — but the conclusion is unchanged: even zeroing Zimbabwe's coverage gap leaves it 3rd of 6, behind only South Africa and Botswana. The adoption, affordability and electricity pillars are on consistent bases.</w:t>
       </w:r>
     </w:p>
     <w:p>
@@ -4168,7 +4168,7 @@
           <w:sz w:val="22"/>
           <w:szCs w:val="22"/>
         </w:rPr>
-        <w:t xml:space="preserve">it has by far the worst coverage gap (44.3) in the group — worse than Malawi, Mozambique and Zambia which all have 85%+ 4G coverage. Yet Zimbabwe's affordability (31.5) and electricity (48.6) are mid-range. This mid-pack position is robust: under six alternative pillar-weighting schemes (reproduced by compute_ddi.py into ddi_sensitivity.csv), Zimbabwe stays between 3rd and 4th of six — it never leaves the bottom half.</w:t>
+        <w:t xml:space="preserve">it has by far the worst coverage gap (44.3) in the group — worse than Malawi, Mozambique and Zambia which all have 85%+ 4G coverage. Yet Zimbabwe's affordability (31.5) and electricity (48.6) are mid-range. This mid-pack position is robust: ranking from best-connected first, Zimbabwe stays 3rd or 4th of six under six alternative pillar-weighting schemes (reproduced by compute_ddi.py into ddi_sensitivity.csv), behind only South Africa and Botswana in the baseline.</w:t>
       </w:r>
       <w:r>
         <w:rPr>

</xml_diff>

<commit_message>
Finalise the report and add a print-ready PDF
Folded in the last correction: the population section now leads with the real
rural figure (about 60% of people live in rural areas, 2022 Census and World
Bank) and keeps the 70.7% rural-district share as a clearly labelled aside.
Exported the finished document to PDF from Word so the tables and figures keep
their formatting, with heading bookmarks for navigation. 19 pages.
</commit_message>
<xml_diff>
--- a/Zimbabwe_Digital_Deserts_Stage2.docx
+++ b/Zimbabwe_Digital_Deserts_Stage2.docx
@@ -4233,14 +4233,14 @@
           <w:sz w:val="22"/>
           <w:szCs w:val="22"/>
         </w:rPr>
-        <w:t xml:space="preserve">70.7% of Zimbabwe's population (10.7 million people) lives in rural districts — the worst-served tier of the Digital Desert Index, scoring 52.4</w:t>
-      </w:r>
-      <w:r>
-        <w:rPr>
-          <w:sz w:val="22"/>
-          <w:szCs w:val="22"/>
-        </w:rPr>
-        <w:t xml:space="preserve">. The 30 urban districts (Bulawayo, the Harare metro, Mutare, Gweru, Kwekwe, Kadoma, Masvingo, Hwange and other towns) hold the remaining 29.3% (4.4 million people) at a far lower DDI of 27.5.</w:t>
+        <w:t xml:space="preserve">About 60% of Zimbabweans live in rural areas (2022 Census and World Bank), and they bear the brunt of the divide: every rural district scores 52.4 on the Digital Desert Index, the worst-served tier</w:t>
+      </w:r>
+      <w:r>
+        <w:rPr>
+          <w:sz w:val="22"/>
+          <w:szCs w:val="22"/>
+        </w:rPr>
+        <w:t xml:space="preserve">. The 30 urban councils (Bulawayo, the Harare metro, Mutare, Gweru, Kwekwe, Kadoma, Masvingo, Hwange and other towns) score a far lower 27.5. (Counted by whole district, 70.7% of people fall in rural-council areas, which also take in peri-urban settlements such as Harare Rural; the 60% above is the census ward-level rural population.)</w:t>
       </w:r>
     </w:p>
     <w:p>
@@ -4653,7 +4653,7 @@
           <w:sz w:val="22"/>
           <w:szCs w:val="22"/>
         </w:rPr>
-        <w:t xml:space="preserve">70.7% of the population lives in rural districts that are digitally excluded</w:t>
+        <w:t xml:space="preserve">about 60% of the population lives in rural areas that are digitally excluded</w:t>
       </w:r>
       <w:r>
         <w:rPr>

</xml_diff>

<commit_message>
Make the report black-and-white for printing
Reworked the document for clean mono printing. The chart scripts now use
distinct grey shades instead of colour (urban dark, rural mid, Starlink solid
black) so the bars stay readable on a black-and-white printer, and the five
figures in the report were regenerated and swapped in. Headings are black, the
navy table headers became dark charcoal with white text, and the red emphasis
text is black. Re-exported the PDF from Word with the same bookmarks. The
on-screen dashboard keeps its colour.
</commit_message>
<xml_diff>
--- a/Zimbabwe_Digital_Deserts_Stage2.docx
+++ b/Zimbabwe_Digital_Deserts_Stage2.docx
@@ -27,7 +27,7 @@
         <w:rPr>
           <w:b/>
           <w:bCs/>
-          <w:color w:val="1F4E79"/>
+          <w:color w:val="000000"/>
           <w:sz w:val="56"/>
           <w:szCs w:val="56"/>
         </w:rPr>
@@ -105,7 +105,7 @@
         <w:rPr>
           <w:b/>
           <w:bCs/>
-          <w:color w:val="1F4E79"/>
+          <w:color w:val="000000"/>
           <w:sz w:val="32"/>
           <w:szCs w:val="32"/>
         </w:rPr>
@@ -209,7 +209,7 @@
         <w:rPr>
           <w:b/>
           <w:bCs/>
-          <w:color w:val="1F4E79"/>
+          <w:color w:val="000000"/>
           <w:sz w:val="26"/>
           <w:szCs w:val="26"/>
         </w:rPr>
@@ -315,7 +315,7 @@
         <w:rPr>
           <w:b/>
           <w:bCs/>
-          <w:color w:val="1F4E79"/>
+          <w:color w:val="000000"/>
           <w:sz w:val="26"/>
           <w:szCs w:val="26"/>
         </w:rPr>
@@ -415,7 +415,7 @@
         <w:rPr>
           <w:b/>
           <w:bCs/>
-          <w:color w:val="1F4E79"/>
+          <w:color w:val="000000"/>
           <w:sz w:val="26"/>
           <w:szCs w:val="26"/>
         </w:rPr>
@@ -448,7 +448,7 @@
         <w:rPr>
           <w:b/>
           <w:bCs/>
-          <w:color w:val="1F4E79"/>
+          <w:color w:val="000000"/>
           <w:sz w:val="32"/>
           <w:szCs w:val="32"/>
         </w:rPr>
@@ -492,7 +492,7 @@
         <w:rPr>
           <w:b/>
           <w:bCs/>
-          <w:color w:val="1F4E79"/>
+          <w:color w:val="000000"/>
           <w:sz w:val="26"/>
           <w:szCs w:val="26"/>
         </w:rPr>
@@ -529,7 +529,7 @@
               <w:bottom w:val="single" w:color="BFBFBF" w:sz="4"/>
               <w:right w:val="single" w:color="BFBFBF" w:sz="4"/>
             </w:tcBorders>
-            <w:shd w:fill="1F4E79" w:val="clear"/>
+            <w:shd w:fill="333333" w:val="clear"/>
             <w:tcMar>
               <w:top w:type="dxa" w:w="100"/>
               <w:left w:type="dxa" w:w="140"/>
@@ -562,7 +562,7 @@
               <w:bottom w:val="single" w:color="BFBFBF" w:sz="4"/>
               <w:right w:val="single" w:color="BFBFBF" w:sz="4"/>
             </w:tcBorders>
-            <w:shd w:fill="1F4E79" w:val="clear"/>
+            <w:shd w:fill="333333" w:val="clear"/>
             <w:tcMar>
               <w:top w:type="dxa" w:w="100"/>
               <w:left w:type="dxa" w:w="140"/>
@@ -595,7 +595,7 @@
               <w:bottom w:val="single" w:color="BFBFBF" w:sz="4"/>
               <w:right w:val="single" w:color="BFBFBF" w:sz="4"/>
             </w:tcBorders>
-            <w:shd w:fill="1F4E79" w:val="clear"/>
+            <w:shd w:fill="333333" w:val="clear"/>
             <w:tcMar>
               <w:top w:type="dxa" w:w="100"/>
               <w:left w:type="dxa" w:w="140"/>
@@ -1181,7 +1181,7 @@
         <w:rPr>
           <w:b/>
           <w:bCs/>
-          <w:color w:val="1F4E79"/>
+          <w:color w:val="000000"/>
           <w:sz w:val="26"/>
           <w:szCs w:val="26"/>
         </w:rPr>
@@ -1547,7 +1547,7 @@
         <w:rPr>
           <w:b/>
           <w:bCs/>
-          <w:color w:val="1F4E79"/>
+          <w:color w:val="000000"/>
           <w:sz w:val="26"/>
           <w:szCs w:val="26"/>
         </w:rPr>
@@ -1724,7 +1724,7 @@
         <w:rPr>
           <w:b/>
           <w:bCs/>
-          <w:color w:val="1F4E79"/>
+          <w:color w:val="000000"/>
           <w:sz w:val="32"/>
           <w:szCs w:val="32"/>
         </w:rPr>
@@ -1752,7 +1752,7 @@
         <w:rPr>
           <w:b/>
           <w:bCs/>
-          <w:color w:val="1F4E79"/>
+          <w:color w:val="000000"/>
           <w:sz w:val="26"/>
           <w:szCs w:val="26"/>
         </w:rPr>
@@ -1772,7 +1772,7 @@
         <w:rPr>
           <w:b/>
           <w:bCs/>
-          <w:color w:val="C00000"/>
+          <w:color w:val="000000"/>
           <w:sz w:val="22"/>
           <w:szCs w:val="22"/>
         </w:rPr>
@@ -1929,7 +1929,7 @@
         <w:rPr>
           <w:b/>
           <w:bCs/>
-          <w:color w:val="C00000"/>
+          <w:color w:val="000000"/>
           <w:sz w:val="22"/>
           <w:szCs w:val="22"/>
         </w:rPr>
@@ -2508,7 +2508,7 @@
         <w:rPr>
           <w:b/>
           <w:bCs/>
-          <w:color w:val="1F4E79"/>
+          <w:color w:val="000000"/>
           <w:sz w:val="26"/>
           <w:szCs w:val="26"/>
         </w:rPr>
@@ -2614,7 +2614,7 @@
         <w:rPr>
           <w:b/>
           <w:bCs/>
-          <w:color w:val="1F4E79"/>
+          <w:color w:val="000000"/>
           <w:sz w:val="26"/>
           <w:szCs w:val="26"/>
         </w:rPr>
@@ -2667,7 +2667,7 @@
               <w:bottom w:val="single" w:color="BFBFBF" w:sz="4"/>
               <w:right w:val="single" w:color="BFBFBF" w:sz="4"/>
             </w:tcBorders>
-            <w:shd w:fill="1F4E79" w:val="clear"/>
+            <w:shd w:fill="333333" w:val="clear"/>
             <w:tcMar>
               <w:top w:type="dxa" w:w="100"/>
               <w:left w:type="dxa" w:w="140"/>
@@ -2700,7 +2700,7 @@
               <w:bottom w:val="single" w:color="BFBFBF" w:sz="4"/>
               <w:right w:val="single" w:color="BFBFBF" w:sz="4"/>
             </w:tcBorders>
-            <w:shd w:fill="1F4E79" w:val="clear"/>
+            <w:shd w:fill="333333" w:val="clear"/>
             <w:tcMar>
               <w:top w:type="dxa" w:w="100"/>
               <w:left w:type="dxa" w:w="140"/>
@@ -2733,7 +2733,7 @@
               <w:bottom w:val="single" w:color="BFBFBF" w:sz="4"/>
               <w:right w:val="single" w:color="BFBFBF" w:sz="4"/>
             </w:tcBorders>
-            <w:shd w:fill="1F4E79" w:val="clear"/>
+            <w:shd w:fill="333333" w:val="clear"/>
             <w:tcMar>
               <w:top w:type="dxa" w:w="100"/>
               <w:left w:type="dxa" w:w="140"/>
@@ -2766,7 +2766,7 @@
               <w:bottom w:val="single" w:color="BFBFBF" w:sz="4"/>
               <w:right w:val="single" w:color="BFBFBF" w:sz="4"/>
             </w:tcBorders>
-            <w:shd w:fill="1F4E79" w:val="clear"/>
+            <w:shd w:fill="333333" w:val="clear"/>
             <w:tcMar>
               <w:top w:type="dxa" w:w="100"/>
               <w:left w:type="dxa" w:w="140"/>
@@ -2799,7 +2799,7 @@
               <w:bottom w:val="single" w:color="BFBFBF" w:sz="4"/>
               <w:right w:val="single" w:color="BFBFBF" w:sz="4"/>
             </w:tcBorders>
-            <w:shd w:fill="1F4E79" w:val="clear"/>
+            <w:shd w:fill="333333" w:val="clear"/>
             <w:tcMar>
               <w:top w:type="dxa" w:w="100"/>
               <w:left w:type="dxa" w:w="140"/>
@@ -2832,7 +2832,7 @@
               <w:bottom w:val="single" w:color="BFBFBF" w:sz="4"/>
               <w:right w:val="single" w:color="BFBFBF" w:sz="4"/>
             </w:tcBorders>
-            <w:shd w:fill="1F4E79" w:val="clear"/>
+            <w:shd w:fill="333333" w:val="clear"/>
             <w:tcMar>
               <w:top w:type="dxa" w:w="100"/>
               <w:left w:type="dxa" w:w="140"/>
@@ -2865,7 +2865,7 @@
               <w:bottom w:val="single" w:color="BFBFBF" w:sz="4"/>
               <w:right w:val="single" w:color="BFBFBF" w:sz="4"/>
             </w:tcBorders>
-            <w:shd w:fill="1F4E79" w:val="clear"/>
+            <w:shd w:fill="333333" w:val="clear"/>
             <w:tcMar>
               <w:top w:type="dxa" w:w="100"/>
               <w:left w:type="dxa" w:w="140"/>
@@ -4174,7 +4174,7 @@
         <w:rPr>
           <w:b/>
           <w:bCs/>
-          <w:color w:val="C00000"/>
+          <w:color w:val="000000"/>
           <w:sz w:val="22"/>
           <w:szCs w:val="22"/>
         </w:rPr>
@@ -4197,7 +4197,7 @@
         <w:rPr>
           <w:b/>
           <w:bCs/>
-          <w:color w:val="1F4E79"/>
+          <w:color w:val="000000"/>
           <w:sz w:val="26"/>
           <w:szCs w:val="26"/>
         </w:rPr>
@@ -4229,7 +4229,7 @@
         <w:rPr>
           <w:b/>
           <w:bCs/>
-          <w:color w:val="C00000"/>
+          <w:color w:val="000000"/>
           <w:sz w:val="22"/>
           <w:szCs w:val="22"/>
         </w:rPr>
@@ -4278,7 +4278,7 @@
         <w:rPr>
           <w:b/>
           <w:bCs/>
-          <w:color w:val="1F4E79"/>
+          <w:color w:val="000000"/>
           <w:sz w:val="26"/>
           <w:szCs w:val="26"/>
         </w:rPr>
@@ -4326,7 +4326,7 @@
               <w:bottom w:val="single" w:color="BFBFBF" w:sz="4"/>
               <w:right w:val="single" w:color="BFBFBF" w:sz="4"/>
             </w:tcBorders>
-            <w:shd w:fill="1F4E79" w:val="clear"/>
+            <w:shd w:fill="333333" w:val="clear"/>
             <w:tcMar>
               <w:top w:type="dxa" w:w="100"/>
               <w:left w:type="dxa" w:w="140"/>
@@ -4359,7 +4359,7 @@
               <w:bottom w:val="single" w:color="BFBFBF" w:sz="4"/>
               <w:right w:val="single" w:color="BFBFBF" w:sz="4"/>
             </w:tcBorders>
-            <w:shd w:fill="1F4E79" w:val="clear"/>
+            <w:shd w:fill="333333" w:val="clear"/>
             <w:tcMar>
               <w:top w:type="dxa" w:w="100"/>
               <w:left w:type="dxa" w:w="140"/>
@@ -4584,7 +4584,7 @@
         <w:rPr>
           <w:b/>
           <w:bCs/>
-          <w:color w:val="1F4E79"/>
+          <w:color w:val="000000"/>
           <w:sz w:val="26"/>
           <w:szCs w:val="26"/>
         </w:rPr>
@@ -4612,7 +4612,7 @@
         <w:rPr>
           <w:b/>
           <w:bCs/>
-          <w:color w:val="1F4E79"/>
+          <w:color w:val="000000"/>
           <w:sz w:val="26"/>
           <w:szCs w:val="26"/>
         </w:rPr>
@@ -5041,7 +5041,7 @@
         <w:rPr>
           <w:b/>
           <w:bCs/>
-          <w:color w:val="1F4E79"/>
+          <w:color w:val="000000"/>
           <w:sz w:val="32"/>
           <w:szCs w:val="32"/>
         </w:rPr>
@@ -5091,7 +5091,7 @@
               <w:bottom w:val="single" w:color="BFBFBF" w:sz="4"/>
               <w:right w:val="single" w:color="BFBFBF" w:sz="4"/>
             </w:tcBorders>
-            <w:shd w:fill="1F4E79" w:val="clear"/>
+            <w:shd w:fill="333333" w:val="clear"/>
             <w:tcMar>
               <w:top w:type="dxa" w:w="100"/>
               <w:left w:type="dxa" w:w="140"/>
@@ -5124,7 +5124,7 @@
               <w:bottom w:val="single" w:color="BFBFBF" w:sz="4"/>
               <w:right w:val="single" w:color="BFBFBF" w:sz="4"/>
             </w:tcBorders>
-            <w:shd w:fill="1F4E79" w:val="clear"/>
+            <w:shd w:fill="333333" w:val="clear"/>
             <w:tcMar>
               <w:top w:type="dxa" w:w="100"/>
               <w:left w:type="dxa" w:w="140"/>
@@ -5157,7 +5157,7 @@
               <w:bottom w:val="single" w:color="BFBFBF" w:sz="4"/>
               <w:right w:val="single" w:color="BFBFBF" w:sz="4"/>
             </w:tcBorders>
-            <w:shd w:fill="1F4E79" w:val="clear"/>
+            <w:shd w:fill="333333" w:val="clear"/>
             <w:tcMar>
               <w:top w:type="dxa" w:w="100"/>
               <w:left w:type="dxa" w:w="140"/>
@@ -5190,7 +5190,7 @@
               <w:bottom w:val="single" w:color="BFBFBF" w:sz="4"/>
               <w:right w:val="single" w:color="BFBFBF" w:sz="4"/>
             </w:tcBorders>
-            <w:shd w:fill="1F4E79" w:val="clear"/>
+            <w:shd w:fill="333333" w:val="clear"/>
             <w:tcMar>
               <w:top w:type="dxa" w:w="100"/>
               <w:left w:type="dxa" w:w="140"/>
@@ -6189,7 +6189,7 @@
         <w:rPr>
           <w:b/>
           <w:bCs/>
-          <w:color w:val="1F4E79"/>
+          <w:color w:val="000000"/>
           <w:sz w:val="26"/>
           <w:szCs w:val="26"/>
         </w:rPr>
@@ -6331,7 +6331,7 @@
         <w:rPr>
           <w:b/>
           <w:bCs/>
-          <w:color w:val="1F4E79"/>
+          <w:color w:val="000000"/>
           <w:sz w:val="26"/>
           <w:szCs w:val="26"/>
         </w:rPr>
@@ -6588,7 +6588,7 @@
     <w:next w:val="Normal"/>
     <w:qFormat/>
     <w:rPr>
-      <w:color w:val="2E74B5"/>
+      <w:color w:val="000000"/>
       <w:sz w:val="32"/>
       <w:szCs w:val="32"/>
     </w:rPr>
@@ -6599,7 +6599,7 @@
     <w:next w:val="Normal"/>
     <w:qFormat/>
     <w:rPr>
-      <w:color w:val="2E74B5"/>
+      <w:color w:val="000000"/>
       <w:sz w:val="26"/>
       <w:szCs w:val="26"/>
     </w:rPr>
@@ -6610,7 +6610,7 @@
     <w:next w:val="Normal"/>
     <w:qFormat/>
     <w:rPr>
-      <w:color w:val="1F4D78"/>
+      <w:color w:val="000000"/>
       <w:sz w:val="24"/>
       <w:szCs w:val="24"/>
     </w:rPr>
@@ -6623,7 +6623,7 @@
     <w:rPr>
       <w:i/>
       <w:iCs/>
-      <w:color w:val="2E74B5"/>
+      <w:color w:val="000000"/>
     </w:rPr>
   </w:style>
   <w:style w:type="paragraph" w:styleId="Heading5">
@@ -6632,7 +6632,7 @@
     <w:next w:val="Normal"/>
     <w:qFormat/>
     <w:rPr>
-      <w:color w:val="2E74B5"/>
+      <w:color w:val="000000"/>
     </w:rPr>
   </w:style>
   <w:style w:type="paragraph" w:styleId="Heading6">
@@ -6641,7 +6641,7 @@
     <w:next w:val="Normal"/>
     <w:qFormat/>
     <w:rPr>
-      <w:color w:val="1F4D78"/>
+      <w:color w:val="000000"/>
     </w:rPr>
   </w:style>
   <w:style w:type="paragraph" w:styleId="Strong">
@@ -6665,7 +6665,7 @@
     <w:uiPriority w:val="99"/>
     <w:unhideWhenUsed/>
     <w:rPr>
-      <w:color w:val="0563C1"/>
+      <w:color w:val="000000"/>
       <w:u w:val="single"/>
     </w:rPr>
   </w:style>
@@ -6756,7 +6756,7 @@
       <w:rFonts w:ascii="Calibri" w:cs="Calibri" w:eastAsia="Calibri" w:hAnsi="Calibri"/>
       <w:b/>
       <w:bCs/>
-      <w:color w:val="1F4E79"/>
+      <w:color w:val="000000"/>
       <w:sz w:val="32"/>
       <w:szCs w:val="32"/>
     </w:rPr>
@@ -6774,7 +6774,7 @@
       <w:rFonts w:ascii="Calibri" w:cs="Calibri" w:eastAsia="Calibri" w:hAnsi="Calibri"/>
       <w:b/>
       <w:bCs/>
-      <w:color w:val="1F4E79"/>
+      <w:color w:val="000000"/>
       <w:sz w:val="26"/>
       <w:szCs w:val="26"/>
     </w:rPr>

</xml_diff>